<commit_message>
Update MN-ENGAGE to v2.0 — formatting and compliance corrections
- Section numbering: Open Issues → 9, Updates to Prior Documents → 10,
  Interview Transcript → 11 (v2.4 eleven-section format)
- Address field type: 'Address' → 'address' (authoritative type list)
- TBD references: MN-ISS-001 → MN-INTAKE-ISS-001,
  MN-ISS-002 → MN-ENGAGE-ISS-002 (proper namespacing)
- Added MN-ENGAGE-ISS-002 to Open Issues table (Topics Covered TBD)
- Meeting Location Type enum: 'CBM Office' → 'Organization Office'
- Topics Covered description: 'CBM leadership' → 'organizational leadership'
- Metadata: Version → 2.0, Last Updated → 03-31-26 22:00,
  Interview Guide → v2.4

No workflow, requirements, or field content changes.
</commit_message>
<xml_diff>
--- a/PRDs/MN/MN-ENGAGE.docx
+++ b/PRDs/MN/MN-ENGAGE.docx
@@ -264,7 +264,7 @@
                 <w:sz w:val="20"/>
                 <w:szCs w:val="20"/>
               </w:rPr>
-              <w:t xml:space="preserve">1.0</w:t>
+              <w:t xml:space="preserve">2.0</w:t>
             </w:r>
           </w:p>
         </w:tc>
@@ -394,7 +394,7 @@
                 <w:sz w:val="20"/>
                 <w:szCs w:val="20"/>
               </w:rPr>
-              <w:t xml:space="preserve">03-31-26 17:00</w:t>
+              <w:t xml:space="preserve">03-31-26 22:00</w:t>
             </w:r>
           </w:p>
         </w:tc>
@@ -524,7 +524,7 @@
                 <w:sz w:val="20"/>
                 <w:szCs w:val="20"/>
               </w:rPr>
-              <w:t xml:space="preserve">interview-process-definition.md v2.0</w:t>
+              <w:t xml:space="preserve">interview-process-definition.md v2.4</w:t>
             </w:r>
           </w:p>
         </w:tc>
@@ -4306,7 +4306,7 @@
                 <w:sz w:val="20"/>
                 <w:szCs w:val="20"/>
               </w:rPr>
-              <w:t xml:space="preserve">Address</w:t>
+              <w:t xml:space="preserve">address</w:t>
             </w:r>
           </w:p>
         </w:tc>
@@ -6238,7 +6238,7 @@
                 <w:sz w:val="20"/>
                 <w:szCs w:val="20"/>
               </w:rPr>
-              <w:t xml:space="preserve">TBD — see MN-ISS-001</w:t>
+              <w:t xml:space="preserve">TBD — see MN-INTAKE-ISS-001</w:t>
             </w:r>
           </w:p>
         </w:tc>
@@ -10177,7 +10177,7 @@
                 <w:sz w:val="20"/>
                 <w:szCs w:val="20"/>
               </w:rPr>
-              <w:t xml:space="preserve">CBM Office, Client’s Place of Business, Other</w:t>
+              <w:t xml:space="preserve">Organization Office, Client’s Place of Business, Other</w:t>
             </w:r>
           </w:p>
         </w:tc>
@@ -10632,7 +10632,7 @@
                 <w:sz w:val="20"/>
                 <w:szCs w:val="20"/>
               </w:rPr>
-              <w:t xml:space="preserve">TBD — see MN-ISS-002</w:t>
+              <w:t xml:space="preserve">TBD — see MN-ENGAGE-ISS-002</w:t>
             </w:r>
           </w:p>
         </w:tc>
@@ -10730,7 +10730,7 @@
                 <w:sz w:val="20"/>
                 <w:szCs w:val="20"/>
               </w:rPr>
-              <w:t xml:space="preserve">The topics discussed during the session. Includes a free-text notes field for additional detail. May be included in the session summary email. Values to be defined by CBM leadership.</w:t>
+              <w:t xml:space="preserve">The topics discussed during the session. Includes a free-text notes field for additional detail. May be included in the session summary email. Values to be defined by organizational leadership.</w:t>
             </w:r>
           </w:p>
         </w:tc>
@@ -12133,7 +12133,7 @@
           <w:sz w:val="32"/>
           <w:szCs w:val="32"/>
         </w:rPr>
-        <w:t xml:space="preserve">Open Issues</w:t>
+        <w:t xml:space="preserve">9. Open Issues</w:t>
       </w:r>
     </w:p>
     <w:tbl>
@@ -12284,6 +12284,72 @@
           </w:p>
         </w:tc>
       </w:tr>
+      <w:tr>
+        <w:tc>
+          <w:tcPr>
+            <w:tcW w:type="dxa" w:w="2000"/>
+            <w:tcBorders>
+              <w:top w:val="single" w:color="AAAAAA" w:sz="1"/>
+              <w:left w:val="single" w:color="AAAAAA" w:sz="1"/>
+              <w:bottom w:val="single" w:color="AAAAAA" w:sz="1"/>
+              <w:right w:val="single" w:color="AAAAAA" w:sz="1"/>
+            </w:tcBorders>
+            <w:shd w:val="clear" w:fill="F2F7FB"/>
+            <w:tcMar>
+              <w:top w:type="dxa" w:w="60"/>
+              <w:left w:type="dxa" w:w="100"/>
+              <w:bottom w:type="dxa" w:w="60"/>
+              <w:right w:type="dxa" w:w="100"/>
+            </w:tcMar>
+          </w:tcPr>
+          <w:p>
+            <w:r>
+              <w:rPr>
+                <w:rFonts w:ascii="Arial" w:cs="Arial" w:eastAsia="Arial" w:hAnsi="Arial"/>
+                <w:b/>
+                <w:bCs/>
+                <w:i w:val="false"/>
+                <w:iCs w:val="false"/>
+                <w:sz w:val="20"/>
+                <w:szCs w:val="20"/>
+              </w:rPr>
+              <w:t xml:space="preserve">MN-ENGAGE-ISS-002</w:t>
+            </w:r>
+          </w:p>
+        </w:tc>
+        <w:tc>
+          <w:tcPr>
+            <w:tcW w:type="dxa" w:w="7360"/>
+            <w:tcBorders>
+              <w:top w:val="single" w:color="AAAAAA" w:sz="1"/>
+              <w:left w:val="single" w:color="AAAAAA" w:sz="1"/>
+              <w:bottom w:val="single" w:color="AAAAAA" w:sz="1"/>
+              <w:right w:val="single" w:color="AAAAAA" w:sz="1"/>
+            </w:tcBorders>
+            <w:shd w:val="clear" w:fill="F2F7FB"/>
+            <w:tcMar>
+              <w:top w:type="dxa" w:w="60"/>
+              <w:left w:type="dxa" w:w="100"/>
+              <w:bottom w:type="dxa" w:w="60"/>
+              <w:right w:type="dxa" w:w="100"/>
+            </w:tcMar>
+          </w:tcPr>
+          <w:p>
+            <w:r>
+              <w:rPr>
+                <w:rFonts w:ascii="Arial" w:cs="Arial" w:eastAsia="Arial" w:hAnsi="Arial"/>
+                <w:b w:val="false"/>
+                <w:bCs w:val="false"/>
+                <w:i w:val="false"/>
+                <w:iCs w:val="false"/>
+                <w:sz w:val="20"/>
+                <w:szCs w:val="20"/>
+              </w:rPr>
+              <w:t xml:space="preserve">Topics Covered (MN-ENGAGE-DAT-029): The complete list of allowed values has not been defined. Values to be defined by organizational leadership. Needs input from: Program leadership.</w:t>
+            </w:r>
+          </w:p>
+        </w:tc>
+      </w:tr>
     </w:tbl>
     <w:p>
       <w:pPr>
@@ -12317,7 +12383,7 @@
           <w:sz w:val="32"/>
           <w:szCs w:val="32"/>
         </w:rPr>
-        <w:t xml:space="preserve">Updates to Prior Documents</w:t>
+        <w:t xml:space="preserve">10. Updates to Prior Documents</w:t>
       </w:r>
     </w:p>
     <w:p>
@@ -12379,7 +12445,7 @@
           <w:sz w:val="32"/>
           <w:szCs w:val="32"/>
         </w:rPr>
-        <w:t xml:space="preserve">9. Interview Transcript</w:t>
+        <w:t xml:space="preserve">11. Interview Transcript</w:t>
       </w:r>
     </w:p>
     <w:p>

</xml_diff>

<commit_message>
MN-ENGAGE v2.1: Add Hold End Date field from MN-INACTIVE cross-process updates
Three changes identified during MN-INACTIVE process definition interview:
- Section 4: Workflow step 10 updated to include Hold End Date
- Section 6: MN-ENGAGE-REQ-005 updated to require Hold End Date on On-Hold
- Section 8: Added Hold End Date field (MN-ENGAGE-DAT-036) after DAT-016
- Section 11: Added post-interview update note documenting changes
- Version incremented to 2.1
</commit_message>
<xml_diff>
--- a/PRDs/MN/MN-ENGAGE.docx
+++ b/PRDs/MN/MN-ENGAGE.docx
@@ -264,7 +264,7 @@
                 <w:sz w:val="20"/>
                 <w:szCs w:val="20"/>
               </w:rPr>
-              <w:t xml:space="preserve">2.0</w:t>
+              <w:t xml:space="preserve">2.1</w:t>
             </w:r>
           </w:p>
         </w:tc>
@@ -394,7 +394,7 @@
                 <w:sz w:val="20"/>
                 <w:szCs w:val="20"/>
               </w:rPr>
-              <w:t xml:space="preserve">03-31-26 22:00</w:t>
+              <w:t xml:space="preserve">03-31-26 21:45</w:t>
             </w:r>
           </w:p>
         </w:tc>
@@ -2185,7 +2185,7 @@
           <w:sz w:val="22"/>
           <w:szCs w:val="22"/>
         </w:rPr>
-        <w:t xml:space="preserve">If the client requests a pause in meetings, the mentor places the Engagement on hold by changing the status to On-Hold and adding an Engagement Note explaining the reason.</w:t>
+        <w:t xml:space="preserve">If the client requests a pause in meetings, the mentor places the Engagement on hold by changing the status to On-Hold, adding an Engagement Note explaining the reason, and setting the Hold End Date to the agreed-upon date when sessions are expected to resume.</w:t>
       </w:r>
     </w:p>
     <w:p>
@@ -3123,7 +3123,7 @@
                 <w:sz w:val="20"/>
                 <w:szCs w:val="20"/>
               </w:rPr>
-              <w:t xml:space="preserve">The system must support placing an Engagement On-Hold with a required Engagement Note explaining the reason, and support manual return to Active status by the mentor.</w:t>
+              <w:t xml:space="preserve">The system must support placing an Engagement On-Hold with a required Engagement Note explaining the reason and a required Hold End Date indicating when the hold is expected to be lifted, and support manual return to Active status by the mentor.</w:t>
             </w:r>
           </w:p>
         </w:tc>
@@ -7554,7 +7554,7 @@
                 <w:sz w:val="20"/>
                 <w:szCs w:val="20"/>
               </w:rPr>
-              <w:t xml:space="preserve">Status</w:t>
+              <w:t xml:space="preserve">Hold End Date</w:t>
             </w:r>
           </w:p>
         </w:tc>
@@ -7586,7 +7586,7 @@
                 <w:sz w:val="20"/>
                 <w:szCs w:val="20"/>
               </w:rPr>
-              <w:t xml:space="preserve">enum</w:t>
+              <w:t xml:space="preserve">date</w:t>
             </w:r>
           </w:p>
         </w:tc>
@@ -7618,7 +7618,7 @@
                 <w:sz w:val="20"/>
                 <w:szCs w:val="20"/>
               </w:rPr>
-              <w:t xml:space="preserve">Yes</w:t>
+              <w:t xml:space="preserve">No</w:t>
             </w:r>
           </w:p>
         </w:tc>
@@ -7650,7 +7650,7 @@
                 <w:sz w:val="20"/>
                 <w:szCs w:val="20"/>
               </w:rPr>
-              <w:t xml:space="preserve">Submitted, Declined, Pending Acceptance, Assigned, Active, On-Hold, Dormant, Inactive, Abandoned, Completed</w:t>
+              <w:t xml:space="preserve">—</w:t>
             </w:r>
           </w:p>
         </w:tc>
@@ -7715,7 +7715,7 @@
                 <w:sz w:val="16"/>
                 <w:szCs w:val="16"/>
               </w:rPr>
-              <w:t xml:space="preserve">MN-ENGAGE-DAT-017</w:t>
+              <w:t xml:space="preserve">MN-ENGAGE-DAT-036</w:t>
             </w:r>
           </w:p>
         </w:tc>
@@ -7751,7 +7751,7 @@
                 <w:sz w:val="20"/>
                 <w:szCs w:val="20"/>
               </w:rPr>
-              <w:t xml:space="preserve">Updated by this process: transitions from Assigned to Active when the first Session is Completed. May transition to On-Hold when the client requests a pause, and back to Active when sessions resume.</w:t>
+              <w:t xml:space="preserve">The expected date for the on-hold period to end, as agreed by the mentor and client. Required when the Engagement is placed On-Hold. Used by the Activity Monitoring process (MN-INACTIVE) as the inactivity comparison date for On-Hold engagements. Prevents indefinite holds.</w:t>
             </w:r>
           </w:p>
         </w:tc>
@@ -7784,7 +7784,7 @@
                 <w:sz w:val="20"/>
                 <w:szCs w:val="20"/>
               </w:rPr>
-              <w:t xml:space="preserve">Total Sessions</w:t>
+              <w:t xml:space="preserve">Status</w:t>
             </w:r>
           </w:p>
         </w:tc>
@@ -7815,7 +7815,7 @@
                 <w:sz w:val="20"/>
                 <w:szCs w:val="20"/>
               </w:rPr>
-              <w:t xml:space="preserve">int</w:t>
+              <w:t xml:space="preserve">enum</w:t>
             </w:r>
           </w:p>
         </w:tc>
@@ -7846,7 +7846,7 @@
                 <w:sz w:val="20"/>
                 <w:szCs w:val="20"/>
               </w:rPr>
-              <w:t xml:space="preserve">No</w:t>
+              <w:t xml:space="preserve">Yes</w:t>
             </w:r>
           </w:p>
         </w:tc>
@@ -7877,7 +7877,7 @@
                 <w:sz w:val="20"/>
                 <w:szCs w:val="20"/>
               </w:rPr>
-              <w:t xml:space="preserve">—</w:t>
+              <w:t xml:space="preserve">Submitted, Declined, Pending Acceptance, Assigned, Active, On-Hold, Dormant, Inactive, Abandoned, Completed</w:t>
             </w:r>
           </w:p>
         </w:tc>
@@ -7940,7 +7940,7 @@
                 <w:sz w:val="16"/>
                 <w:szCs w:val="16"/>
               </w:rPr>
-              <w:t xml:space="preserve">MN-ENGAGE-DAT-018</w:t>
+              <w:t xml:space="preserve">MN-ENGAGE-DAT-017</w:t>
             </w:r>
           </w:p>
         </w:tc>
@@ -7975,7 +7975,7 @@
                 <w:sz w:val="20"/>
                 <w:szCs w:val="20"/>
               </w:rPr>
-              <w:t xml:space="preserve">The total number of completed sessions logged against this engagement. System-calculated. Read-only.</w:t>
+              <w:t xml:space="preserve">Updated by this process: transitions from Assigned to Active when the first Session is Completed. May transition to On-Hold when the client requests a pause, and back to Active when sessions resume.</w:t>
             </w:r>
           </w:p>
         </w:tc>
@@ -8009,7 +8009,7 @@
                 <w:sz w:val="20"/>
                 <w:szCs w:val="20"/>
               </w:rPr>
-              <w:t xml:space="preserve">Total Sessions (Last 30 Days)</w:t>
+              <w:t xml:space="preserve">Total Sessions</w:t>
             </w:r>
           </w:p>
         </w:tc>
@@ -8170,7 +8170,7 @@
                 <w:sz w:val="16"/>
                 <w:szCs w:val="16"/>
               </w:rPr>
-              <w:t xml:space="preserve">MN-ENGAGE-DAT-019</w:t>
+              <w:t xml:space="preserve">MN-ENGAGE-DAT-018</w:t>
             </w:r>
           </w:p>
         </w:tc>
@@ -8206,7 +8206,7 @@
                 <w:sz w:val="20"/>
                 <w:szCs w:val="20"/>
               </w:rPr>
-              <w:t xml:space="preserve">The number of completed sessions logged in the last 30 days. Used by the Activity Monitoring process (MN-INACTIVE) to assess recent engagement activity. System-calculated. Read-only.</w:t>
+              <w:t xml:space="preserve">The total number of completed sessions logged against this engagement. System-calculated. Read-only.</w:t>
             </w:r>
           </w:p>
         </w:tc>
@@ -8239,7 +8239,7 @@
                 <w:sz w:val="20"/>
                 <w:szCs w:val="20"/>
               </w:rPr>
-              <w:t xml:space="preserve">Last Session Date</w:t>
+              <w:t xml:space="preserve">Total Sessions (Last 30 Days)</w:t>
             </w:r>
           </w:p>
         </w:tc>
@@ -8270,7 +8270,7 @@
                 <w:sz w:val="20"/>
                 <w:szCs w:val="20"/>
               </w:rPr>
-              <w:t xml:space="preserve">date</w:t>
+              <w:t xml:space="preserve">int</w:t>
             </w:r>
           </w:p>
         </w:tc>
@@ -8395,7 +8395,7 @@
                 <w:sz w:val="16"/>
                 <w:szCs w:val="16"/>
               </w:rPr>
-              <w:t xml:space="preserve">MN-ENGAGE-DAT-020</w:t>
+              <w:t xml:space="preserve">MN-ENGAGE-DAT-019</w:t>
             </w:r>
           </w:p>
         </w:tc>
@@ -8430,7 +8430,7 @@
                 <w:sz w:val="20"/>
                 <w:szCs w:val="20"/>
               </w:rPr>
-              <w:t xml:space="preserve">The date of the most recently completed session. Used by the Activity Monitoring process (MN-INACTIVE) to measure time since last qualifying activity. System-calculated. Read-only.</w:t>
+              <w:t xml:space="preserve">The number of completed sessions logged in the last 30 days. Used by the Activity Monitoring process (MN-INACTIVE) to assess recent engagement activity. System-calculated. Read-only.</w:t>
             </w:r>
           </w:p>
         </w:tc>
@@ -8464,7 +8464,7 @@
                 <w:sz w:val="20"/>
                 <w:szCs w:val="20"/>
               </w:rPr>
-              <w:t xml:space="preserve">Total Session Hours</w:t>
+              <w:t xml:space="preserve">Last Session Date</w:t>
             </w:r>
           </w:p>
         </w:tc>
@@ -8496,7 +8496,7 @@
                 <w:sz w:val="20"/>
                 <w:szCs w:val="20"/>
               </w:rPr>
-              <w:t xml:space="preserve">float</w:t>
+              <w:t xml:space="preserve">date</w:t>
             </w:r>
           </w:p>
         </w:tc>
@@ -8625,7 +8625,7 @@
                 <w:sz w:val="16"/>
                 <w:szCs w:val="16"/>
               </w:rPr>
-              <w:t xml:space="preserve">MN-ENGAGE-DAT-021</w:t>
+              <w:t xml:space="preserve">MN-ENGAGE-DAT-020</w:t>
             </w:r>
           </w:p>
         </w:tc>
@@ -8661,7 +8661,7 @@
                 <w:sz w:val="20"/>
                 <w:szCs w:val="20"/>
               </w:rPr>
-              <w:t xml:space="preserve">The total hours of mentoring delivered in this engagement. Calculated from the Duration field across all completed Session records. System-calculated. Read-only.</w:t>
+              <w:t xml:space="preserve">The date of the most recently completed session. Used by the Activity Monitoring process (MN-INACTIVE) to measure time since last qualifying activity. System-calculated. Read-only.</w:t>
             </w:r>
           </w:p>
         </w:tc>
@@ -8694,7 +8694,7 @@
                 <w:sz w:val="20"/>
                 <w:szCs w:val="20"/>
               </w:rPr>
-              <w:t xml:space="preserve">Next Session Date/Time</w:t>
+              <w:t xml:space="preserve">Total Session Hours</w:t>
             </w:r>
           </w:p>
         </w:tc>
@@ -8725,7 +8725,7 @@
                 <w:sz w:val="20"/>
                 <w:szCs w:val="20"/>
               </w:rPr>
-              <w:t xml:space="preserve">datetime</w:t>
+              <w:t xml:space="preserve">float</w:t>
             </w:r>
           </w:p>
         </w:tc>
@@ -8850,7 +8850,7 @@
                 <w:sz w:val="16"/>
                 <w:szCs w:val="16"/>
               </w:rPr>
-              <w:t xml:space="preserve">MN-ENGAGE-DAT-022</w:t>
+              <w:t xml:space="preserve">MN-ENGAGE-DAT-021</w:t>
             </w:r>
           </w:p>
         </w:tc>
@@ -8866,6 +8866,237 @@
               <w:bottom w:val="single" w:color="AAAAAA" w:sz="1"/>
               <w:right w:val="single" w:color="AAAAAA" w:sz="1"/>
             </w:tcBorders>
+            <w:tcMar>
+              <w:top w:type="dxa" w:w="40"/>
+              <w:left w:type="dxa" w:w="100"/>
+              <w:bottom w:type="dxa" w:w="80"/>
+              <w:right w:type="dxa" w:w="100"/>
+            </w:tcMar>
+          </w:tcPr>
+          <w:p>
+            <w:r>
+              <w:rPr>
+                <w:rFonts w:ascii="Arial" w:cs="Arial" w:eastAsia="Arial" w:hAnsi="Arial"/>
+                <w:b w:val="false"/>
+                <w:bCs w:val="false"/>
+                <w:i w:val="false"/>
+                <w:iCs w:val="false"/>
+                <w:color w:val="888888"/>
+                <w:sz w:val="20"/>
+                <w:szCs w:val="20"/>
+              </w:rPr>
+              <w:t xml:space="preserve">The total hours of mentoring delivered in this engagement. Calculated from the Duration field across all completed Session records. System-calculated. Read-only.</w:t>
+            </w:r>
+          </w:p>
+        </w:tc>
+      </w:tr>
+      <w:tr>
+        <w:tc>
+          <w:tcPr>
+            <w:tcW w:type="dxa" w:w="2200"/>
+            <w:tcBorders>
+              <w:top w:val="single" w:color="AAAAAA" w:sz="1"/>
+              <w:left w:val="single" w:color="AAAAAA" w:sz="1"/>
+              <w:bottom w:val="single" w:color="AAAAAA" w:sz="1"/>
+              <w:right w:val="single" w:color="AAAAAA" w:sz="1"/>
+            </w:tcBorders>
+            <w:shd w:fill="F2F7FB" w:val="clear"/>
+            <w:tcMar>
+              <w:top w:type="dxa" w:w="60"/>
+              <w:left w:type="dxa" w:w="100"/>
+              <w:bottom w:type="dxa" w:w="60"/>
+              <w:right w:type="dxa" w:w="100"/>
+            </w:tcMar>
+          </w:tcPr>
+          <w:p>
+            <w:r>
+              <w:rPr>
+                <w:rFonts w:ascii="Arial" w:cs="Arial" w:eastAsia="Arial" w:hAnsi="Arial"/>
+                <w:b/>
+                <w:bCs/>
+                <w:i w:val="false"/>
+                <w:iCs w:val="false"/>
+                <w:sz w:val="20"/>
+                <w:szCs w:val="20"/>
+              </w:rPr>
+              <w:t xml:space="preserve">Next Session Date/Time</w:t>
+            </w:r>
+          </w:p>
+        </w:tc>
+        <w:tc>
+          <w:tcPr>
+            <w:tcW w:type="dxa" w:w="1100"/>
+            <w:tcBorders>
+              <w:top w:val="single" w:color="AAAAAA" w:sz="1"/>
+              <w:left w:val="single" w:color="AAAAAA" w:sz="1"/>
+              <w:bottom w:val="single" w:color="AAAAAA" w:sz="1"/>
+              <w:right w:val="single" w:color="AAAAAA" w:sz="1"/>
+            </w:tcBorders>
+            <w:shd w:fill="F2F7FB" w:val="clear"/>
+            <w:tcMar>
+              <w:top w:type="dxa" w:w="60"/>
+              <w:left w:type="dxa" w:w="100"/>
+              <w:bottom w:type="dxa" w:w="60"/>
+              <w:right w:type="dxa" w:w="100"/>
+            </w:tcMar>
+          </w:tcPr>
+          <w:p>
+            <w:r>
+              <w:rPr>
+                <w:rFonts w:ascii="Arial" w:cs="Arial" w:eastAsia="Arial" w:hAnsi="Arial"/>
+                <w:b w:val="false"/>
+                <w:bCs w:val="false"/>
+                <w:i w:val="false"/>
+                <w:iCs w:val="false"/>
+                <w:sz w:val="20"/>
+                <w:szCs w:val="20"/>
+              </w:rPr>
+              <w:t xml:space="preserve">datetime</w:t>
+            </w:r>
+          </w:p>
+        </w:tc>
+        <w:tc>
+          <w:tcPr>
+            <w:tcW w:type="dxa" w:w="800"/>
+            <w:tcBorders>
+              <w:top w:val="single" w:color="AAAAAA" w:sz="1"/>
+              <w:left w:val="single" w:color="AAAAAA" w:sz="1"/>
+              <w:bottom w:val="single" w:color="AAAAAA" w:sz="1"/>
+              <w:right w:val="single" w:color="AAAAAA" w:sz="1"/>
+            </w:tcBorders>
+            <w:shd w:fill="F2F7FB" w:val="clear"/>
+            <w:tcMar>
+              <w:top w:type="dxa" w:w="60"/>
+              <w:left w:type="dxa" w:w="100"/>
+              <w:bottom w:type="dxa" w:w="60"/>
+              <w:right w:type="dxa" w:w="100"/>
+            </w:tcMar>
+          </w:tcPr>
+          <w:p>
+            <w:r>
+              <w:rPr>
+                <w:rFonts w:ascii="Arial" w:cs="Arial" w:eastAsia="Arial" w:hAnsi="Arial"/>
+                <w:b w:val="false"/>
+                <w:bCs w:val="false"/>
+                <w:i w:val="false"/>
+                <w:iCs w:val="false"/>
+                <w:sz w:val="20"/>
+                <w:szCs w:val="20"/>
+              </w:rPr>
+              <w:t xml:space="preserve">No</w:t>
+            </w:r>
+          </w:p>
+        </w:tc>
+        <w:tc>
+          <w:tcPr>
+            <w:tcW w:type="dxa" w:w="2400"/>
+            <w:tcBorders>
+              <w:top w:val="single" w:color="AAAAAA" w:sz="1"/>
+              <w:left w:val="single" w:color="AAAAAA" w:sz="1"/>
+              <w:bottom w:val="single" w:color="AAAAAA" w:sz="1"/>
+              <w:right w:val="single" w:color="AAAAAA" w:sz="1"/>
+            </w:tcBorders>
+            <w:shd w:fill="F2F7FB" w:val="clear"/>
+            <w:tcMar>
+              <w:top w:type="dxa" w:w="60"/>
+              <w:left w:type="dxa" w:w="100"/>
+              <w:bottom w:type="dxa" w:w="60"/>
+              <w:right w:type="dxa" w:w="100"/>
+            </w:tcMar>
+          </w:tcPr>
+          <w:p>
+            <w:r>
+              <w:rPr>
+                <w:rFonts w:ascii="Arial" w:cs="Arial" w:eastAsia="Arial" w:hAnsi="Arial"/>
+                <w:b w:val="false"/>
+                <w:bCs w:val="false"/>
+                <w:i w:val="false"/>
+                <w:iCs w:val="false"/>
+                <w:sz w:val="20"/>
+                <w:szCs w:val="20"/>
+              </w:rPr>
+              <w:t xml:space="preserve">—</w:t>
+            </w:r>
+          </w:p>
+        </w:tc>
+        <w:tc>
+          <w:tcPr>
+            <w:tcW w:type="dxa" w:w="1000"/>
+            <w:tcBorders>
+              <w:top w:val="single" w:color="AAAAAA" w:sz="1"/>
+              <w:left w:val="single" w:color="AAAAAA" w:sz="1"/>
+              <w:bottom w:val="single" w:color="AAAAAA" w:sz="1"/>
+              <w:right w:val="single" w:color="AAAAAA" w:sz="1"/>
+            </w:tcBorders>
+            <w:shd w:fill="F2F7FB" w:val="clear"/>
+            <w:tcMar>
+              <w:top w:type="dxa" w:w="60"/>
+              <w:left w:type="dxa" w:w="100"/>
+              <w:bottom w:type="dxa" w:w="60"/>
+              <w:right w:type="dxa" w:w="100"/>
+            </w:tcMar>
+          </w:tcPr>
+          <w:p>
+            <w:r>
+              <w:rPr>
+                <w:rFonts w:ascii="Arial" w:cs="Arial" w:eastAsia="Arial" w:hAnsi="Arial"/>
+                <w:b w:val="false"/>
+                <w:bCs w:val="false"/>
+                <w:i w:val="false"/>
+                <w:iCs w:val="false"/>
+                <w:sz w:val="20"/>
+                <w:szCs w:val="20"/>
+              </w:rPr>
+              <w:t xml:space="preserve">—</w:t>
+            </w:r>
+          </w:p>
+        </w:tc>
+        <w:tc>
+          <w:tcPr>
+            <w:tcW w:type="dxa" w:w="1860"/>
+            <w:tcBorders>
+              <w:top w:val="single" w:color="AAAAAA" w:sz="1"/>
+              <w:left w:val="single" w:color="AAAAAA" w:sz="1"/>
+              <w:bottom w:val="single" w:color="AAAAAA" w:sz="1"/>
+              <w:right w:val="single" w:color="AAAAAA" w:sz="1"/>
+            </w:tcBorders>
+            <w:shd w:fill="F2F7FB" w:val="clear"/>
+            <w:tcMar>
+              <w:top w:type="dxa" w:w="60"/>
+              <w:left w:type="dxa" w:w="100"/>
+              <w:bottom w:type="dxa" w:w="60"/>
+              <w:right w:type="dxa" w:w="100"/>
+            </w:tcMar>
+          </w:tcPr>
+          <w:p>
+            <w:r>
+              <w:rPr>
+                <w:rFonts w:ascii="Arial" w:cs="Arial" w:eastAsia="Arial" w:hAnsi="Arial"/>
+                <w:b w:val="false"/>
+                <w:bCs w:val="false"/>
+                <w:i w:val="false"/>
+                <w:iCs w:val="false"/>
+                <w:color w:val="888888"/>
+                <w:sz w:val="16"/>
+                <w:szCs w:val="16"/>
+              </w:rPr>
+              <w:t xml:space="preserve">MN-ENGAGE-DAT-022</w:t>
+            </w:r>
+          </w:p>
+        </w:tc>
+      </w:tr>
+      <w:tr>
+        <w:tc>
+          <w:tcPr>
+            <w:tcW w:type="dxa" w:w="9360"/>
+            <w:gridSpan w:val="6"/>
+            <w:tcBorders>
+              <w:top w:val="single" w:color="AAAAAA" w:sz="1"/>
+              <w:left w:val="single" w:color="AAAAAA" w:sz="1"/>
+              <w:bottom w:val="single" w:color="AAAAAA" w:sz="1"/>
+              <w:right w:val="single" w:color="AAAAAA" w:sz="1"/>
+            </w:tcBorders>
+            <w:shd w:fill="F2F7FB" w:val="clear"/>
             <w:tcMar>
               <w:top w:type="dxa" w:w="40"/>
               <w:left w:type="dxa" w:w="100"/>
@@ -14748,6 +14979,40 @@
           <w:szCs w:val="20"/>
         </w:rPr>
         <w:t xml:space="preserve">The goal is to capture 100% of the content. Condense without losing the information requested and data provided. Do what makes sense, and we can review and update the instructions if there is a better way.</w:t>
+      </w:r>
+    </w:p>
+    <w:p>
+      <w:pPr>
+        <w:spacing w:after="40"/>
+      </w:pPr>
+      <w:r>
+        <w:rPr>
+          <w:rFonts w:ascii="Arial" w:cs="Arial" w:eastAsia="Arial" w:hAnsi="Arial"/>
+          <w:b/>
+          <w:bCs/>
+          <w:i w:val="false"/>
+          <w:iCs w:val="false"/>
+          <w:sz w:val="22"/>
+          <w:szCs w:val="22"/>
+        </w:rPr>
+        <w:t xml:space="preserve">Hold End Date (Post-Interview Update from MN-INACTIVE)</w:t>
+      </w:r>
+    </w:p>
+    <w:p>
+      <w:pPr>
+        <w:spacing w:after="120"/>
+      </w:pPr>
+      <w:r>
+        <w:rPr>
+          <w:rFonts w:ascii="Arial" w:cs="Arial" w:eastAsia="Arial" w:hAnsi="Arial"/>
+          <w:b w:val="false"/>
+          <w:bCs w:val="false"/>
+          <w:i w:val="false"/>
+          <w:iCs w:val="false"/>
+          <w:sz w:val="20"/>
+          <w:szCs w:val="20"/>
+        </w:rPr>
+        <w:t xml:space="preserve">During the Activity Monitoring (MN-INACTIVE) process definition interview, the need for a Hold End Date field on the Engagement entity was identified. On-Hold engagements without an expected end date cannot be effectively monitored for inactivity, because the Activity Monitoring process uses Hold End Date as the comparison date for determining whether an On-Hold engagement has exceeded its expected hold period. Three changes were applied to this document in v2.1 to maintain cross-process consistency: (1) a new Hold End Date field (MN-ENGAGE-DAT-036) was added to Section 8; (2) MN-ENGAGE-REQ-005 in Section 6 was updated to require Hold End Date when placing an Engagement On-Hold; and (3) the workflow step describing the On-Hold action in Section 4 was updated to include setting the Hold End Date.</w:t>
       </w:r>
     </w:p>
     <w:sectPr>

</xml_diff>

<commit_message>
MN-ENGAGE v2.2: Remove New Business Started from Session entity
Per MN-CLOSE interview decision, New Business Started is no longer
tracked at the session level. The field (MN-ENGAGE-DAT-032) has been
removed from the Session entity in Section 8. The metric is now
defined on the Engagement entity in MN-CLOSE (MN-CLOSE-DAT-013),
accessible throughout the engagement lifecycle.

Updated version to 2.2, added transcript note documenting the change.
</commit_message>
<xml_diff>
--- a/PRDs/MN/MN-ENGAGE.docx
+++ b/PRDs/MN/MN-ENGAGE.docx
@@ -264,7 +264,7 @@
                 <w:sz w:val="20"/>
                 <w:szCs w:val="20"/>
               </w:rPr>
-              <w:t xml:space="preserve">2.1</w:t>
+              <w:t xml:space="preserve">2.2</w:t>
             </w:r>
           </w:p>
         </w:tc>
@@ -394,7 +394,7 @@
                 <w:sz w:val="20"/>
                 <w:szCs w:val="20"/>
               </w:rPr>
-              <w:t xml:space="preserve">03-31-26 21:45</w:t>
+              <w:t xml:space="preserve">04-01-26 00:30</w:t>
             </w:r>
           </w:p>
         </w:tc>
@@ -11431,237 +11431,6 @@
               <w:bottom w:val="single" w:color="AAAAAA" w:sz="1"/>
               <w:right w:val="single" w:color="AAAAAA" w:sz="1"/>
             </w:tcBorders>
-            <w:shd w:fill="F2F7FB" w:val="clear"/>
-            <w:tcMar>
-              <w:top w:type="dxa" w:w="60"/>
-              <w:left w:type="dxa" w:w="100"/>
-              <w:bottom w:type="dxa" w:w="60"/>
-              <w:right w:type="dxa" w:w="100"/>
-            </w:tcMar>
-          </w:tcPr>
-          <w:p>
-            <w:r>
-              <w:rPr>
-                <w:rFonts w:ascii="Arial" w:cs="Arial" w:eastAsia="Arial" w:hAnsi="Arial"/>
-                <w:b/>
-                <w:bCs/>
-                <w:i w:val="false"/>
-                <w:iCs w:val="false"/>
-                <w:sz w:val="20"/>
-                <w:szCs w:val="20"/>
-              </w:rPr>
-              <w:t xml:space="preserve">New Business Started</w:t>
-            </w:r>
-          </w:p>
-        </w:tc>
-        <w:tc>
-          <w:tcPr>
-            <w:tcW w:type="dxa" w:w="1100"/>
-            <w:tcBorders>
-              <w:top w:val="single" w:color="AAAAAA" w:sz="1"/>
-              <w:left w:val="single" w:color="AAAAAA" w:sz="1"/>
-              <w:bottom w:val="single" w:color="AAAAAA" w:sz="1"/>
-              <w:right w:val="single" w:color="AAAAAA" w:sz="1"/>
-            </w:tcBorders>
-            <w:shd w:fill="F2F7FB" w:val="clear"/>
-            <w:tcMar>
-              <w:top w:type="dxa" w:w="60"/>
-              <w:left w:type="dxa" w:w="100"/>
-              <w:bottom w:type="dxa" w:w="60"/>
-              <w:right w:type="dxa" w:w="100"/>
-            </w:tcMar>
-          </w:tcPr>
-          <w:p>
-            <w:r>
-              <w:rPr>
-                <w:rFonts w:ascii="Arial" w:cs="Arial" w:eastAsia="Arial" w:hAnsi="Arial"/>
-                <w:b w:val="false"/>
-                <w:bCs w:val="false"/>
-                <w:i w:val="false"/>
-                <w:iCs w:val="false"/>
-                <w:sz w:val="20"/>
-                <w:szCs w:val="20"/>
-              </w:rPr>
-              <w:t xml:space="preserve">bool</w:t>
-            </w:r>
-          </w:p>
-        </w:tc>
-        <w:tc>
-          <w:tcPr>
-            <w:tcW w:type="dxa" w:w="800"/>
-            <w:tcBorders>
-              <w:top w:val="single" w:color="AAAAAA" w:sz="1"/>
-              <w:left w:val="single" w:color="AAAAAA" w:sz="1"/>
-              <w:bottom w:val="single" w:color="AAAAAA" w:sz="1"/>
-              <w:right w:val="single" w:color="AAAAAA" w:sz="1"/>
-            </w:tcBorders>
-            <w:shd w:fill="F2F7FB" w:val="clear"/>
-            <w:tcMar>
-              <w:top w:type="dxa" w:w="60"/>
-              <w:left w:type="dxa" w:w="100"/>
-              <w:bottom w:type="dxa" w:w="60"/>
-              <w:right w:type="dxa" w:w="100"/>
-            </w:tcMar>
-          </w:tcPr>
-          <w:p>
-            <w:r>
-              <w:rPr>
-                <w:rFonts w:ascii="Arial" w:cs="Arial" w:eastAsia="Arial" w:hAnsi="Arial"/>
-                <w:b w:val="false"/>
-                <w:bCs w:val="false"/>
-                <w:i w:val="false"/>
-                <w:iCs w:val="false"/>
-                <w:sz w:val="20"/>
-                <w:szCs w:val="20"/>
-              </w:rPr>
-              <w:t xml:space="preserve">No</w:t>
-            </w:r>
-          </w:p>
-        </w:tc>
-        <w:tc>
-          <w:tcPr>
-            <w:tcW w:type="dxa" w:w="2400"/>
-            <w:tcBorders>
-              <w:top w:val="single" w:color="AAAAAA" w:sz="1"/>
-              <w:left w:val="single" w:color="AAAAAA" w:sz="1"/>
-              <w:bottom w:val="single" w:color="AAAAAA" w:sz="1"/>
-              <w:right w:val="single" w:color="AAAAAA" w:sz="1"/>
-            </w:tcBorders>
-            <w:shd w:fill="F2F7FB" w:val="clear"/>
-            <w:tcMar>
-              <w:top w:type="dxa" w:w="60"/>
-              <w:left w:type="dxa" w:w="100"/>
-              <w:bottom w:type="dxa" w:w="60"/>
-              <w:right w:type="dxa" w:w="100"/>
-            </w:tcMar>
-          </w:tcPr>
-          <w:p>
-            <w:r>
-              <w:rPr>
-                <w:rFonts w:ascii="Arial" w:cs="Arial" w:eastAsia="Arial" w:hAnsi="Arial"/>
-                <w:b w:val="false"/>
-                <w:bCs w:val="false"/>
-                <w:i w:val="false"/>
-                <w:iCs w:val="false"/>
-                <w:sz w:val="20"/>
-                <w:szCs w:val="20"/>
-              </w:rPr>
-              <w:t xml:space="preserve">—</w:t>
-            </w:r>
-          </w:p>
-        </w:tc>
-        <w:tc>
-          <w:tcPr>
-            <w:tcW w:type="dxa" w:w="1000"/>
-            <w:tcBorders>
-              <w:top w:val="single" w:color="AAAAAA" w:sz="1"/>
-              <w:left w:val="single" w:color="AAAAAA" w:sz="1"/>
-              <w:bottom w:val="single" w:color="AAAAAA" w:sz="1"/>
-              <w:right w:val="single" w:color="AAAAAA" w:sz="1"/>
-            </w:tcBorders>
-            <w:shd w:fill="F2F7FB" w:val="clear"/>
-            <w:tcMar>
-              <w:top w:type="dxa" w:w="60"/>
-              <w:left w:type="dxa" w:w="100"/>
-              <w:bottom w:type="dxa" w:w="60"/>
-              <w:right w:type="dxa" w:w="100"/>
-            </w:tcMar>
-          </w:tcPr>
-          <w:p>
-            <w:r>
-              <w:rPr>
-                <w:rFonts w:ascii="Arial" w:cs="Arial" w:eastAsia="Arial" w:hAnsi="Arial"/>
-                <w:b w:val="false"/>
-                <w:bCs w:val="false"/>
-                <w:i w:val="false"/>
-                <w:iCs w:val="false"/>
-                <w:sz w:val="20"/>
-                <w:szCs w:val="20"/>
-              </w:rPr>
-              <w:t xml:space="preserve">—</w:t>
-            </w:r>
-          </w:p>
-        </w:tc>
-        <w:tc>
-          <w:tcPr>
-            <w:tcW w:type="dxa" w:w="1860"/>
-            <w:tcBorders>
-              <w:top w:val="single" w:color="AAAAAA" w:sz="1"/>
-              <w:left w:val="single" w:color="AAAAAA" w:sz="1"/>
-              <w:bottom w:val="single" w:color="AAAAAA" w:sz="1"/>
-              <w:right w:val="single" w:color="AAAAAA" w:sz="1"/>
-            </w:tcBorders>
-            <w:shd w:fill="F2F7FB" w:val="clear"/>
-            <w:tcMar>
-              <w:top w:type="dxa" w:w="60"/>
-              <w:left w:type="dxa" w:w="100"/>
-              <w:bottom w:type="dxa" w:w="60"/>
-              <w:right w:type="dxa" w:w="100"/>
-            </w:tcMar>
-          </w:tcPr>
-          <w:p>
-            <w:r>
-              <w:rPr>
-                <w:rFonts w:ascii="Arial" w:cs="Arial" w:eastAsia="Arial" w:hAnsi="Arial"/>
-                <w:b w:val="false"/>
-                <w:bCs w:val="false"/>
-                <w:i w:val="false"/>
-                <w:iCs w:val="false"/>
-                <w:color w:val="888888"/>
-                <w:sz w:val="16"/>
-                <w:szCs w:val="16"/>
-              </w:rPr>
-              <w:t xml:space="preserve">MN-ENGAGE-DAT-032</w:t>
-            </w:r>
-          </w:p>
-        </w:tc>
-      </w:tr>
-      <w:tr>
-        <w:tc>
-          <w:tcPr>
-            <w:tcW w:type="dxa" w:w="9360"/>
-            <w:gridSpan w:val="6"/>
-            <w:tcBorders>
-              <w:top w:val="single" w:color="AAAAAA" w:sz="1"/>
-              <w:left w:val="single" w:color="AAAAAA" w:sz="1"/>
-              <w:bottom w:val="single" w:color="AAAAAA" w:sz="1"/>
-              <w:right w:val="single" w:color="AAAAAA" w:sz="1"/>
-            </w:tcBorders>
-            <w:shd w:fill="F2F7FB" w:val="clear"/>
-            <w:tcMar>
-              <w:top w:type="dxa" w:w="40"/>
-              <w:left w:type="dxa" w:w="100"/>
-              <w:bottom w:type="dxa" w:w="80"/>
-              <w:right w:type="dxa" w:w="100"/>
-            </w:tcMar>
-          </w:tcPr>
-          <w:p>
-            <w:r>
-              <w:rPr>
-                <w:rFonts w:ascii="Arial" w:cs="Arial" w:eastAsia="Arial" w:hAnsi="Arial"/>
-                <w:b w:val="false"/>
-                <w:bCs w:val="false"/>
-                <w:i w:val="false"/>
-                <w:iCs w:val="false"/>
-                <w:color w:val="888888"/>
-                <w:sz w:val="20"/>
-                <w:szCs w:val="20"/>
-              </w:rPr>
-              <w:t xml:space="preserve">Whether this session resulted in the client starting a new business. Tracked for funder impact reporting.</w:t>
-            </w:r>
-          </w:p>
-        </w:tc>
-      </w:tr>
-      <w:tr>
-        <w:tc>
-          <w:tcPr>
-            <w:tcW w:type="dxa" w:w="2200"/>
-            <w:tcBorders>
-              <w:top w:val="single" w:color="AAAAAA" w:sz="1"/>
-              <w:left w:val="single" w:color="AAAAAA" w:sz="1"/>
-              <w:bottom w:val="single" w:color="AAAAAA" w:sz="1"/>
-              <w:right w:val="single" w:color="AAAAAA" w:sz="1"/>
-            </w:tcBorders>
             <w:tcMar>
               <w:top w:type="dxa" w:w="60"/>
               <w:left w:type="dxa" w:w="100"/>
@@ -15013,6 +14782,34 @@
           <w:szCs w:val="20"/>
         </w:rPr>
         <w:t xml:space="preserve">During the Activity Monitoring (MN-INACTIVE) process definition interview, the need for a Hold End Date field on the Engagement entity was identified. On-Hold engagements without an expected end date cannot be effectively monitored for inactivity, because the Activity Monitoring process uses Hold End Date as the comparison date for determining whether an On-Hold engagement has exceeded its expected hold period. Three changes were applied to this document in v2.1 to maintain cross-process consistency: (1) a new Hold End Date field (MN-ENGAGE-DAT-036) was added to Section 8; (2) MN-ENGAGE-REQ-005 in Section 6 was updated to require Hold End Date when placing an Engagement On-Hold; and (3) the workflow step describing the On-Hold action in Section 4 was updated to include setting the Hold End Date.</w:t>
+      </w:r>
+    </w:p>
+    <w:p>
+      <w:pPr>
+        <w:spacing w:after="40"/>
+      </w:pPr>
+      <w:r>
+        <w:rPr>
+          <w:rFonts w:ascii="Arial" w:cs="Arial" w:eastAsia="Arial" w:hAnsi="Arial"/>
+          <w:b/>
+          <w:bCs/>
+          <w:sz w:val="20"/>
+          <w:szCs w:val="20"/>
+        </w:rPr>
+        <w:t xml:space="preserve">New Business Started Field Removal (Post-Interview Update from MN-CLOSE)</w:t>
+      </w:r>
+    </w:p>
+    <w:p>
+      <w:pPr>
+        <w:spacing w:after="120"/>
+      </w:pPr>
+      <w:r>
+        <w:rPr>
+          <w:rFonts w:ascii="Arial" w:cs="Arial" w:eastAsia="Arial" w:hAnsi="Arial"/>
+          <w:sz w:val="20"/>
+          <w:szCs w:val="20"/>
+        </w:rPr>
+        <w:t xml:space="preserve">During the Engagement Closure (MN-CLOSE) process definition interview, the administrator confirmed that tracking New Business Started at the session level is not important — it should be tracked as an overall engagement outcome instead. The New Business Started field (MN-ENGAGE-DAT-032, bool) has been removed from the Session entity in Section 8. The field is now defined on the Engagement entity in MN-CLOSE as MN-CLOSE-DAT-013, where it is accessible throughout the engagement lifecycle with closure serving as the final prompt for completion.</w:t>
       </w:r>
     </w:p>
     <w:sectPr>

</xml_diff>